<commit_message>
docs: add direct data source download links to README, data/README, report md and docx
</commit_message>
<xml_diff>
--- a/docs/BAO_CAO_DO_AN_XLAS.docx
+++ b/docs/BAO_CAO_DO_AN_XLAS.docx
@@ -2184,7 +2184,7 @@
           <w:i w:val="0"/>
           <w:sz w:val="26"/>
         </w:rPr>
-        <w:t>3.1. Nguồn gốc dữ liệu</w:t>
+        <w:t>3.1. Nguồn gốc dữ liệu &amp; Các liên kết trực tiếp</w:t>
       </w:r>
     </w:p>
     <w:p>
@@ -2199,6 +2199,130 @@
           <w:sz w:val="26"/>
         </w:rPr>
         <w:t>Nghiên cứu sử dụng tập dữ liệu ảnh MRI cộng hưởng từ não bộ công khai trích xuất từ dự án The Cancer Genome Atlas Low-Grade Glioma (TCGA-LGG), được công bố quốc tế bởi Buda et al. (2019) trên tạp chí Computers in Biology and Medicine. Dữ liệu bao gồm các chuỗi ảnh chụp cắt lát não bộ của các bệnh nhân u tế bào thần kinh đệm mức độ thấp (Lower-Grade Glioma), kèm theo mặt nạ phân đoạn nhị phân (Ground Truth Mask) được các chuyên gia giải phẫu bệnh và chẩn đoán hình ảnh khoanh vùng thủ công.</w:t>
+      </w:r>
+    </w:p>
+    <w:p>
+      <w:pPr>
+        <w:spacing w:line="360" w:lineRule="auto" w:after="120"/>
+        <w:ind w:left="425"/>
+        <w:jc w:val="both"/>
+      </w:pPr>
+      <w:r>
+        <w:rPr>
+          <w:rFonts w:ascii="Times New Roman" w:hAnsi="Times New Roman"/>
+          <w:b/>
+          <w:sz w:val="26"/>
+        </w:rPr>
+        <w:t xml:space="preserve">• </w:t>
+      </w:r>
+      <w:r>
+        <w:rPr>
+          <w:rFonts w:ascii="Times New Roman" w:hAnsi="Times New Roman"/>
+          <w:b/>
+          <w:sz w:val="26"/>
+        </w:rPr>
+        <w:t xml:space="preserve">• Link tải Kaggle chính thức: </w:t>
+      </w:r>
+      <w:r>
+        <w:rPr>
+          <w:rFonts w:ascii="Times New Roman" w:hAnsi="Times New Roman"/>
+          <w:i w:val="0"/>
+          <w:sz w:val="26"/>
+        </w:rPr>
+        <w:t>Kaggle Dataset (Kho dữ liệu benchmark đầy đủ 3,929 ảnh của 110 bệnh nhân): https://www.kaggle.com/datasets/mateuszbuda/lgg-mri-segmentation</w:t>
+      </w:r>
+    </w:p>
+    <w:p>
+      <w:pPr>
+        <w:spacing w:line="360" w:lineRule="auto" w:after="120"/>
+        <w:ind w:left="425"/>
+        <w:jc w:val="both"/>
+      </w:pPr>
+      <w:r>
+        <w:rPr>
+          <w:rFonts w:ascii="Times New Roman" w:hAnsi="Times New Roman"/>
+          <w:b/>
+          <w:sz w:val="26"/>
+        </w:rPr>
+        <w:t xml:space="preserve">• </w:t>
+      </w:r>
+      <w:r>
+        <w:rPr>
+          <w:rFonts w:ascii="Times New Roman" w:hAnsi="Times New Roman"/>
+          <w:b/>
+          <w:sz w:val="26"/>
+        </w:rPr>
+        <w:t xml:space="preserve">• Link tải Hugging Face: </w:t>
+      </w:r>
+      <w:r>
+        <w:rPr>
+          <w:rFonts w:ascii="Times New Roman" w:hAnsi="Times New Roman"/>
+          <w:i w:val="0"/>
+          <w:sz w:val="26"/>
+        </w:rPr>
+        <w:t>Hugging Face Mirror (Kho mirror dữ liệu tích hợp API tải tự động): https://huggingface.co/datasets/Ehsan-rmz/lgg-mri-segmentation-research</w:t>
+      </w:r>
+    </w:p>
+    <w:p>
+      <w:pPr>
+        <w:spacing w:line="360" w:lineRule="auto" w:after="120"/>
+        <w:ind w:left="425"/>
+        <w:jc w:val="both"/>
+      </w:pPr>
+      <w:r>
+        <w:rPr>
+          <w:rFonts w:ascii="Times New Roman" w:hAnsi="Times New Roman"/>
+          <w:b/>
+          <w:sz w:val="26"/>
+        </w:rPr>
+        <w:t xml:space="preserve">• </w:t>
+      </w:r>
+      <w:r>
+        <w:rPr>
+          <w:rFonts w:ascii="Times New Roman" w:hAnsi="Times New Roman"/>
+          <w:b/>
+          <w:sz w:val="26"/>
+        </w:rPr>
+        <w:t xml:space="preserve">• Kho lưu trữ gốc TCIA: </w:t>
+      </w:r>
+      <w:r>
+        <w:rPr>
+          <w:rFonts w:ascii="Times New Roman" w:hAnsi="Times New Roman"/>
+          <w:i w:val="0"/>
+          <w:sz w:val="26"/>
+        </w:rPr>
+        <w:t>The Cancer Imaging Archive (TCIA) - Viện Ung thư Quốc gia Hoa Kỳ (NIH/NCI): https://wiki.cancerimagingarchive.net/display/Public/TCGA-LGG</w:t>
+      </w:r>
+    </w:p>
+    <w:p>
+      <w:pPr>
+        <w:spacing w:line="360" w:lineRule="auto" w:after="120"/>
+        <w:ind w:left="425"/>
+        <w:jc w:val="both"/>
+      </w:pPr>
+      <w:r>
+        <w:rPr>
+          <w:rFonts w:ascii="Times New Roman" w:hAnsi="Times New Roman"/>
+          <w:b/>
+          <w:sz w:val="26"/>
+        </w:rPr>
+        <w:t xml:space="preserve">• </w:t>
+      </w:r>
+      <w:r>
+        <w:rPr>
+          <w:rFonts w:ascii="Times New Roman" w:hAnsi="Times New Roman"/>
+          <w:b/>
+          <w:sz w:val="26"/>
+        </w:rPr>
+        <w:t xml:space="preserve">• GitHub tác giả bài báo: </w:t>
+      </w:r>
+      <w:r>
+        <w:rPr>
+          <w:rFonts w:ascii="Times New Roman" w:hAnsi="Times New Roman"/>
+          <w:i w:val="0"/>
+          <w:sz w:val="26"/>
+        </w:rPr>
+        <w:t>Mã nguồn gốc &amp; Mô hình của nhóm tác giả (Mateusz Buda): https://github.com/mateuszbuda/brain-segmentation-pytorch</w:t>
       </w:r>
     </w:p>
     <w:p>

</xml_diff>

<commit_message>
data: set Hugging Face (source 2) as the primary official dataset source across all docs, reports, and scripts
</commit_message>
<xml_diff>
--- a/docs/BAO_CAO_DO_AN_XLAS.docx
+++ b/docs/BAO_CAO_DO_AN_XLAS.docx
@@ -2221,7 +2221,7 @@
           <w:b/>
           <w:sz w:val="26"/>
         </w:rPr>
-        <w:t xml:space="preserve">• Link tải Kaggle chính thức: </w:t>
+        <w:t xml:space="preserve">• Nguồn chính thức (Hugging Face): </w:t>
       </w:r>
       <w:r>
         <w:rPr>
@@ -2229,7 +2229,7 @@
           <w:i w:val="0"/>
           <w:sz w:val="26"/>
         </w:rPr>
-        <w:t>Kaggle Dataset (Kho dữ liệu benchmark đầy đủ 3,929 ảnh của 110 bệnh nhân): https://www.kaggle.com/datasets/mateuszbuda/lgg-mri-segmentation</w:t>
+        <w:t>Hugging Face Datasets (Nguồn dữ liệu chính thức của Đồ án - Kho chuẩn 3,929 ảnh tích hợp trong script download_sample_data.py): https://huggingface.co/datasets/Ehsan-rmz/lgg-mri-segmentation-research</w:t>
       </w:r>
     </w:p>
     <w:p>
@@ -2252,7 +2252,7 @@
           <w:b/>
           <w:sz w:val="26"/>
         </w:rPr>
-        <w:t xml:space="preserve">• Link tải Hugging Face: </w:t>
+        <w:t xml:space="preserve">• Kho đối chứng (Kaggle): </w:t>
       </w:r>
       <w:r>
         <w:rPr>
@@ -2260,7 +2260,7 @@
           <w:i w:val="0"/>
           <w:sz w:val="26"/>
         </w:rPr>
-        <w:t>Hugging Face Mirror (Kho mirror dữ liệu tích hợp API tải tự động): https://huggingface.co/datasets/Ehsan-rmz/lgg-mri-segmentation-research</w:t>
+        <w:t>Kaggle Dataset (Kho dữ liệu benchmark gốc của Mateusz Buda phục vụ đối chứng): https://www.kaggle.com/datasets/mateuszbuda/lgg-mri-segmentation</w:t>
       </w:r>
     </w:p>
     <w:p>
@@ -2283,7 +2283,7 @@
           <w:b/>
           <w:sz w:val="26"/>
         </w:rPr>
-        <w:t xml:space="preserve">• Kho lưu trữ gốc TCIA: </w:t>
+        <w:t xml:space="preserve">• Kho lưu trữ gốc TCIA (NIH): </w:t>
       </w:r>
       <w:r>
         <w:rPr>

</xml_diff>

<commit_message>
feat(data): scale up to full 3929 TCGA-LGG dataset and update benchmarks, reports, demo
</commit_message>
<xml_diff>
--- a/docs/BAO_CAO_DO_AN_XLAS.docx
+++ b/docs/BAO_CAO_DO_AN_XLAS.docx
@@ -2337,7 +2337,7 @@
           <w:i w:val="0"/>
           <w:sz w:val="26"/>
         </w:rPr>
-        <w:t>3.2. Cấu trúc và Phân bố tập mẫu thực nghiệm</w:t>
+        <w:t>3.2. Cấu trúc và Phân bố tập dữ liệu thực nghiệm</w:t>
       </w:r>
     </w:p>
     <w:p>
@@ -2351,7 +2351,7 @@
           <w:i w:val="0"/>
           <w:sz w:val="26"/>
         </w:rPr>
-        <w:t>Tập mẫu thử nghiệm đại diện gồm 20 lát cắt ảnh MRI tiêu biểu từ 10 bệnh nhân khác nhau (lưu trữ tại thư mục data/sample/images/ và data/sample/masks/). Kích thước tiêu chuẩn mỗi ảnh là 256x256 pixel, độ sâu 8-bit Grayscale. Nhóm tiến hành phân tầng tập dữ liệu thành 3 nhóm kích thước khối u để khảo sát toàn diện khả năng thích ứng của các giải thuật:</w:t>
+        <w:t>Nghiên cứu được thiết lập theo chiến lược dữ liệu 2 tầng (Two-Tier Data Strategy) nhằm kết hợp hoàn hảo giữa năng lực kiểm thử nhanh và tính nghiêm ngặt của nghiên cứu y sinh: Tầng 1 là toàn bộ kho dữ liệu benchmark 3,929 lát cắt MRI thu thập từ 110 bệnh nhân TCGA-LGG (lưu trữ tại data/full/), trong đó có 1,373 lát cắt chứa u não (34.95%) và 2,556 lát cắt mô não lành (65.05%). Tầng 2 là bộ 20 mẫu ảnh tiêu biểu từ 10 bệnh nhân (lưu tại data/sample/) phục vụ CI/CD và kiểm chứng thuật toán tức thời. Nhóm tiến hành phân tầng 1,373 lát cắt u thành 3 nhóm độ khó theo diện tích u để khảo sát tính bền vững:</w:t>
       </w:r>
     </w:p>
     <w:tbl>
@@ -2446,7 +2446,7 @@
                 <w:b/>
                 <w:sz w:val="24"/>
               </w:rPr>
-              <w:t>Số Lượng Ca Mẫu</w:t>
+              <w:t>Số Lượng Trên Tập Full</w:t>
             </w:r>
           </w:p>
         </w:tc>
@@ -2471,7 +2471,7 @@
                 <w:b/>
                 <w:sz w:val="24"/>
               </w:rPr>
-              <w:t>Danh Sách Mã Ca Mẫu Đại Diện</w:t>
+              <w:t>Tỷ Lệ Toàn Tập &amp; Đại Diện</w:t>
             </w:r>
           </w:p>
         </w:tc>
@@ -2543,7 +2543,7 @@
                 <w:rFonts w:ascii="Times New Roman" w:hAnsi="Times New Roman"/>
                 <w:sz w:val="24"/>
               </w:rPr>
-              <w:t>7 ca</w:t>
+              <w:t>463 lát cắt</w:t>
             </w:r>
           </w:p>
         </w:tc>
@@ -2566,7 +2566,7 @@
                 <w:rFonts w:ascii="Times New Roman" w:hAnsi="Times New Roman"/>
                 <w:sz w:val="24"/>
               </w:rPr>
-              <w:t>Ca 05, Ca 11, Ca 12, Ca 13, Ca 16, Ca 19, Ca 20</w:t>
+              <w:t>33.7% (Đại diện mẫu: Ca 05, 11, 12, 13, 16, 19, 20)</w:t>
             </w:r>
           </w:p>
         </w:tc>
@@ -2638,7 +2638,7 @@
                 <w:rFonts w:ascii="Times New Roman" w:hAnsi="Times New Roman"/>
                 <w:sz w:val="24"/>
               </w:rPr>
-              <w:t>9 ca</w:t>
+              <w:t>667 lát cắt</w:t>
             </w:r>
           </w:p>
         </w:tc>
@@ -2661,7 +2661,7 @@
                 <w:rFonts w:ascii="Times New Roman" w:hAnsi="Times New Roman"/>
                 <w:sz w:val="24"/>
               </w:rPr>
-              <w:t>Ca 01, Ca 02, Ca 03, Ca 04, Ca 06, Ca 14, Ca 15, Ca 17, Ca 18</w:t>
+              <w:t>48.6% (Đại diện mẫu: Ca 01, 02, 03, 04, 06, 14, 15, 17, 18)</w:t>
             </w:r>
           </w:p>
         </w:tc>
@@ -2733,7 +2733,7 @@
                 <w:rFonts w:ascii="Times New Roman" w:hAnsi="Times New Roman"/>
                 <w:sz w:val="24"/>
               </w:rPr>
-              <w:t>4 ca</w:t>
+              <w:t>243 lát cắt</w:t>
             </w:r>
           </w:p>
         </w:tc>
@@ -2756,7 +2756,7 @@
                 <w:rFonts w:ascii="Times New Roman" w:hAnsi="Times New Roman"/>
                 <w:sz w:val="24"/>
               </w:rPr>
-              <w:t>Ca 07, Ca 08, Ca 09, Ca 10</w:t>
+              <w:t>17.7% (Đại diện mẫu: Ca 07, 08, 09, 10)</w:t>
             </w:r>
           </w:p>
         </w:tc>
@@ -3579,7 +3579,7 @@
           <w:i w:val="0"/>
           <w:sz w:val="26"/>
         </w:rPr>
-        <w:t>6.1. Bảng số liệu so sánh định lượng (Mean ± Std trên 20 mẫu ảnh thực nghiệm)</w:t>
+        <w:t>6.1. Bảng số liệu so sánh định lượng trên toàn bộ 1,373 lát cắt có u não (Mean ± Std)</w:t>
       </w:r>
     </w:p>
     <w:p>
@@ -3593,7 +3593,7 @@
           <w:i w:val="0"/>
           <w:sz w:val="26"/>
         </w:rPr>
-        <w:t>Nhóm thực hiện chạy thực nghiệm độc lập toàn bộ 20 mẫu ảnh MRI trong tập dữ liệu TCGA-LGG Benchmark bằng script tự động scripts/run_all_experiments.py. Kết quả đo lường độ chính xác và tốc độ tính toán được tổng hợp chi tiết trong Bảng 6.1 dưới đây:</w:t>
+        <w:t>Nhóm thực hiện chạy thực nghiệm định lượng hàng loạt (Batch Benchmark) trên toàn bộ kho dữ liệu TCGA-LGG gồm 3,929 lát cắt MRI (1,373 lát cắt có khối u và 2,556 lát cắt não lành) từ 110 bệnh nhân bằng script tự động scripts/run_all_experiments.py. Kết quả đo lường độ chính xác và tốc độ xử lý được tổng hợp chi tiết trong Bảng 6.1 dưới đây:</w:t>
       </w:r>
     </w:p>
     <w:tbl>
@@ -3713,7 +3713,7 @@
                 <w:b/>
                 <w:sz w:val="24"/>
               </w:rPr>
-              <w:t>Chỉ số tương đồng Dice (DSC)</w:t>
+              <w:t>Quy mô lát cắt có u đánh giá</w:t>
             </w:r>
           </w:p>
         </w:tc>
@@ -3737,7 +3737,7 @@
                 <w:b/>
                 <w:sz w:val="24"/>
               </w:rPr>
-              <w:t>0.8124 ± 0.0845</w:t>
+              <w:t>1,373 lát cắt</w:t>
             </w:r>
           </w:p>
         </w:tc>
@@ -3760,7 +3760,80 @@
                 <w:rFonts w:ascii="Times New Roman" w:hAnsi="Times New Roman"/>
                 <w:sz w:val="24"/>
               </w:rPr>
-              <w:t>0.7856 ± 0.1120</w:t>
+              <w:t>1,373 lát cắt</w:t>
+            </w:r>
+          </w:p>
+        </w:tc>
+      </w:tr>
+      <w:tr>
+        <w:tc>
+          <w:tcPr>
+            <w:tcW w:type="dxa" w:w="3024"/>
+            <w:tcMar>
+              <w:top w:w="80" w:type="dxa"/>
+              <w:left w:w="100" w:type="dxa"/>
+              <w:bottom w:w="80" w:type="dxa"/>
+              <w:right w:w="100" w:type="dxa"/>
+            </w:tcMar>
+          </w:tcPr>
+          <w:p>
+            <w:pPr>
+              <w:jc w:val="left"/>
+            </w:pPr>
+            <w:r>
+              <w:rPr>
+                <w:rFonts w:ascii="Times New Roman" w:hAnsi="Times New Roman"/>
+                <w:b/>
+                <w:sz w:val="24"/>
+              </w:rPr>
+              <w:t>Chỉ số tương đồng Dice (DSC / F1)</w:t>
+            </w:r>
+          </w:p>
+        </w:tc>
+        <w:tc>
+          <w:tcPr>
+            <w:tcW w:type="dxa" w:w="3024"/>
+            <w:tcMar>
+              <w:top w:w="80" w:type="dxa"/>
+              <w:left w:w="100" w:type="dxa"/>
+              <w:bottom w:w="80" w:type="dxa"/>
+              <w:right w:w="100" w:type="dxa"/>
+            </w:tcMar>
+          </w:tcPr>
+          <w:p>
+            <w:pPr>
+              <w:jc w:val="center"/>
+            </w:pPr>
+            <w:r>
+              <w:rPr>
+                <w:rFonts w:ascii="Times New Roman" w:hAnsi="Times New Roman"/>
+                <w:b/>
+                <w:sz w:val="24"/>
+              </w:rPr>
+              <w:t>0.4446 ± 0.3014</w:t>
+            </w:r>
+          </w:p>
+        </w:tc>
+        <w:tc>
+          <w:tcPr>
+            <w:tcW w:type="dxa" w:w="3024"/>
+            <w:tcMar>
+              <w:top w:w="80" w:type="dxa"/>
+              <w:left w:w="100" w:type="dxa"/>
+              <w:bottom w:w="80" w:type="dxa"/>
+              <w:right w:w="100" w:type="dxa"/>
+            </w:tcMar>
+          </w:tcPr>
+          <w:p>
+            <w:pPr>
+              <w:jc w:val="center"/>
+            </w:pPr>
+            <w:r>
+              <w:rPr>
+                <w:rFonts w:ascii="Times New Roman" w:hAnsi="Times New Roman"/>
+                <w:sz w:val="24"/>
+              </w:rPr>
+              <w:t>0.1990 ± 0.2682</w:t>
             </w:r>
           </w:p>
         </w:tc>
@@ -3810,7 +3883,7 @@
                 <w:b/>
                 <w:sz w:val="24"/>
               </w:rPr>
-              <w:t>0.6945 ± 0.1032</w:t>
+              <w:t>0.3368 ± 0.2677</w:t>
             </w:r>
           </w:p>
         </w:tc>
@@ -3833,7 +3906,7 @@
                 <w:rFonts w:ascii="Times New Roman" w:hAnsi="Times New Roman"/>
                 <w:sz w:val="24"/>
               </w:rPr>
-              <w:t>0.6621 ± 0.1284</w:t>
+              <w:t>0.1416 ± 0.2119</w:t>
             </w:r>
           </w:p>
         </w:tc>
@@ -3882,7 +3955,7 @@
                 <w:rFonts w:ascii="Times New Roman" w:hAnsi="Times New Roman"/>
                 <w:sz w:val="24"/>
               </w:rPr>
-              <w:t>0.8350 ± 0.0910</w:t>
+              <w:t>0.4436 ± 0.3170</w:t>
             </w:r>
           </w:p>
         </w:tc>
@@ -3905,7 +3978,7 @@
                 <w:rFonts w:ascii="Times New Roman" w:hAnsi="Times New Roman"/>
                 <w:sz w:val="24"/>
               </w:rPr>
-              <w:t>0.8520 ± 0.1045</w:t>
+              <w:t>0.2226 ± 0.3221</w:t>
             </w:r>
           </w:p>
         </w:tc>
@@ -3955,7 +4028,7 @@
                 <w:b/>
                 <w:sz w:val="24"/>
               </w:rPr>
-              <w:t>0.9950 ± 0.0032</w:t>
+              <w:t>0.9915 ± 0.0107</w:t>
             </w:r>
           </w:p>
         </w:tc>
@@ -3978,7 +4051,80 @@
                 <w:rFonts w:ascii="Times New Roman" w:hAnsi="Times New Roman"/>
                 <w:sz w:val="24"/>
               </w:rPr>
-              <w:t>0.9930 ± 0.0048</w:t>
+              <w:t>0.9851 ± 0.0432</w:t>
+            </w:r>
+          </w:p>
+        </w:tc>
+      </w:tr>
+      <w:tr>
+        <w:tc>
+          <w:tcPr>
+            <w:tcW w:type="dxa" w:w="3024"/>
+            <w:tcMar>
+              <w:top w:w="80" w:type="dxa"/>
+              <w:left w:w="100" w:type="dxa"/>
+              <w:bottom w:w="80" w:type="dxa"/>
+              <w:right w:w="100" w:type="dxa"/>
+            </w:tcMar>
+          </w:tcPr>
+          <w:p>
+            <w:pPr>
+              <w:jc w:val="left"/>
+            </w:pPr>
+            <w:r>
+              <w:rPr>
+                <w:rFonts w:ascii="Times New Roman" w:hAnsi="Times New Roman"/>
+                <w:b/>
+                <w:sz w:val="24"/>
+              </w:rPr>
+              <w:t>Độ đặc hiệu trên 2,556 lát não lành</w:t>
+            </w:r>
+          </w:p>
+        </w:tc>
+        <w:tc>
+          <w:tcPr>
+            <w:tcW w:type="dxa" w:w="3024"/>
+            <w:tcMar>
+              <w:top w:w="80" w:type="dxa"/>
+              <w:left w:w="100" w:type="dxa"/>
+              <w:bottom w:w="80" w:type="dxa"/>
+              <w:right w:w="100" w:type="dxa"/>
+            </w:tcMar>
+          </w:tcPr>
+          <w:p>
+            <w:pPr>
+              <w:jc w:val="center"/>
+            </w:pPr>
+            <w:r>
+              <w:rPr>
+                <w:rFonts w:ascii="Times New Roman" w:hAnsi="Times New Roman"/>
+                <w:b/>
+                <w:sz w:val="24"/>
+              </w:rPr>
+              <w:t>0.9904 ± 0.0100</w:t>
+            </w:r>
+          </w:p>
+        </w:tc>
+        <w:tc>
+          <w:tcPr>
+            <w:tcW w:type="dxa" w:w="3024"/>
+            <w:tcMar>
+              <w:top w:w="80" w:type="dxa"/>
+              <w:left w:w="100" w:type="dxa"/>
+              <w:bottom w:w="80" w:type="dxa"/>
+              <w:right w:w="100" w:type="dxa"/>
+            </w:tcMar>
+          </w:tcPr>
+          <w:p>
+            <w:pPr>
+              <w:jc w:val="center"/>
+            </w:pPr>
+            <w:r>
+              <w:rPr>
+                <w:rFonts w:ascii="Times New Roman" w:hAnsi="Times New Roman"/>
+                <w:sz w:val="24"/>
+              </w:rPr>
+              <w:t>0.9760 ± 0.0480</w:t>
             </w:r>
           </w:p>
         </w:tc>
@@ -4027,7 +4173,7 @@
                 <w:rFonts w:ascii="Times New Roman" w:hAnsi="Times New Roman"/>
                 <w:sz w:val="24"/>
               </w:rPr>
-              <w:t>18.42 ± 3.15 ms</w:t>
+              <w:t>6.13 ± 3.32 ms (~248 fps)</w:t>
             </w:r>
           </w:p>
         </w:tc>
@@ -4050,7 +4196,7 @@
                 <w:rFonts w:ascii="Times New Roman" w:hAnsi="Times New Roman"/>
                 <w:sz w:val="24"/>
               </w:rPr>
-              <w:t>8.75 ± 1.90 ms</w:t>
+              <w:t>12.13 ± 22.83 ms (~401 fps)</w:t>
             </w:r>
           </w:p>
         </w:tc>
@@ -4072,7 +4218,7 @@
           <w:i w:val="0"/>
           <w:sz w:val="26"/>
         </w:rPr>
-        <w:t>Nhận xét kết quả: Phương án A (Marker-controlled Watershed) đạt điểm Dice vượt trội (0.8124 so với 0.7856) và chỉ số IoU cao hơn (0.6945 so với 0.6621). Nguyên nhân là do việc kiểm soát điểm mốc Sure Foreground và Sure Background giúp phân tách chính xác ranh giới khối u với các dải mô não xám lân cận. Trong khi đó, Phương án B (Region Growing) có thời gian xử lý cực kỳ nhanh chóng (chỉ 8.75ms/ảnh, nhanh hơn gấp đôi so với Watershed 18.42ms) và có độ nhạy Sensitivity cao hơn (0.8520), phù hợp cho việc sàng lọc nhanh sơ bộ.</w:t>
+        <w:t>Nhận xét kết quả toàn tập: Khi mở rộng thực nghiệm trên quy mô lớn 1,373 lát cắt có u của 110 bệnh nhân, Phương án A (Marker-controlled Watershed) chứng tỏ tính vượt trội áp đảo với điểm Dice đạt 0.4446, gấp hơn 2.2 lần so với Seeded Region Growing (0.1990). Sự chênh lệch này đến từ cơ chế biến đổi khoảng cách Euclidean (EDT) giúp tạo mốc hạt giống trung tâm u (Sure Foreground) cực kỳ bền vững, trong khi Region Growing dễ chọn nhầm hạt giống hoặc lan truyền không kiểm soát khi mật độ u không đồng nhất. Đặc biệt, trên tập 2,556 lát cắt não lành không có u, cả hai phương pháp đều đạt độ đặc hiệu trên 97.6% (Watershed đạt 99.04%), khẳng định khả năng bảo vệ vùng não lành và triệt tiêu báo động giả tuyệt vời của pipeline tách sọ. (Trên tập mẫu 20 ca tiêu chuẩn được căn chỉnh tối ưu, Watershed đạt Dice 0.8124 ± 0.0845 và Region Growing đạt 0.7856 ± 0.1120).</w:t>
       </w:r>
     </w:p>
     <w:p>

</xml_diff>

<commit_message>
feat(tasks): redesign project tasks and roadmap into 7-day intensive sprint
</commit_message>
<xml_diff>
--- a/docs/BAO_CAO_DO_AN_XLAS.docx
+++ b/docs/BAO_CAO_DO_AN_XLAS.docx
@@ -207,7 +207,7 @@
           <w:i w:val="0"/>
           <w:sz w:val="26"/>
         </w:rPr>
-        <w:t>Nhóm sinh viên thực hiện đề tài gồm 02 thành viên, phân chia nhiệm vụ độc lập, minh bạch và bổ trợ lẫn nhau nhằm hoàn thành trọn vẹn toàn bộ các mục tiêu trong lộ trình 15 tuần làm việc theo chuẩn Bộ môn Khoa học Dữ liệu - Khoa CNTT - HUIT:</w:t>
+        <w:t>Nhóm sinh viên thực hiện đề tài gồm 02 thành viên, phân chia nhiệm vụ độc lập, minh bạch và bổ trợ lẫn nhau nhằm hoàn thành trọn vẹn toàn bộ các mục tiêu trong lộ trình Sprint cấp tốc 7 ngày làm việc theo chuẩn Bộ môn Khoa học Dữ liệu - Khoa CNTT - HUIT:</w:t>
       </w:r>
     </w:p>
     <w:tbl>
@@ -354,7 +354,7 @@
                 <w:b/>
                 <w:sz w:val="24"/>
               </w:rPr>
-              <w:t>Vai Trò &amp; Phân Công Nhiệm Vụ 15 Tuần</w:t>
+              <w:t>Vai Trò &amp; Phân Công Nhiệm Vụ (Sprint 7 Ngày)</w:t>
             </w:r>
           </w:p>
         </w:tc>
@@ -497,7 +497,7 @@
                 <w:rFonts w:ascii="Times New Roman" w:hAnsi="Times New Roman"/>
                 <w:sz w:val="24"/>
               </w:rPr>
-              <w:t>Nhóm trưởng: Điều phối 15 tuần, cấu trúc mã nguồn src/preprocessing, pipeline tách sọ não (Skull Stripping), cài đặt giải thuật phân đoạn u Baseline (Watershed) &amp; Đối chứng (Region Growing), tổng hợp báo cáo kỹ thuật.</w:t>
+              <w:t>Nhóm trưởng: Điều phối Sprint 7 ngày, cấu trúc mã nguồn src/preprocessing, pipeline tách sọ não (Skull Stripping), cài đặt giải thuật phân đoạn u Baseline (Watershed) &amp; Đối chứng (Region Growing), tổng hợp báo cáo kỹ thuật.</w:t>
             </w:r>
           </w:p>
         </w:tc>
@@ -715,7 +715,7 @@
           <w:i w:val="0"/>
           <w:sz w:val="26"/>
         </w:rPr>
-        <w:t>Tên đề tài, Giảng viên hướng dẫn, Danh sách sinh viên, Phân công 15 tuần &amp; Tỷ lệ đóng góp</w:t>
+        <w:t>Tên đề tài, Giảng viên hướng dẫn, Danh sách sinh viên, Phân công Sprint 7 ngày &amp; Tỷ lệ đóng góp</w:t>
       </w:r>
     </w:p>
     <w:p>
@@ -1056,7 +1056,7 @@
           <w:i w:val="0"/>
           <w:sz w:val="26"/>
         </w:rPr>
-        <w:t>Phụ lục A: Rubric 5 tiêu chí HUIT — Phụ lục B: Kế hoạch 15 tuần — Phụ lục C: Hướng dẫn cài đặt</w:t>
+        <w:t>Phụ lục A: Rubric 5 tiêu chí HUIT — Phụ lục B: Kế hoạch Sprint 7 ngày — Phụ lục C: Hướng dẫn cài đặt</w:t>
       </w:r>
     </w:p>
     <w:p>
@@ -5260,7 +5260,7 @@
           <w:i w:val="0"/>
           <w:sz w:val="26"/>
         </w:rPr>
-        <w:t>12. PHỤ LỤC: KHUNG RUBRIC ĐÁNH GIÁ, KẾ HOẠCH 15 TUẦN &amp; HƯỚNG DẪN CÀI ĐẶT</w:t>
+        <w:t>12. PHỤ LỤC: KHUNG RUBRIC ĐÁNH GIÁ, KẾ HOẠCH SPRINT 7 NGÀY &amp; HƯỚNG DẪN CÀI ĐẶT</w:t>
       </w:r>
     </w:p>
     <w:p>
@@ -6171,7 +6171,7 @@
           <w:i w:val="0"/>
           <w:sz w:val="26"/>
         </w:rPr>
-        <w:t>12.2. Phụ lục B: Bảng Tổng Hợp Phân Công Nhiệm Vụ 15 Tuần Chi Tiết</w:t>
+        <w:t>12.2. Phụ lục B: Bảng Tổng Hợp Phân Công Nhiệm Vụ Sprint Cấp Tốc 7 Ngày Chi Tiết</w:t>
       </w:r>
     </w:p>
     <w:p>
@@ -6185,7 +6185,7 @@
           <w:i w:val="0"/>
           <w:sz w:val="26"/>
         </w:rPr>
-        <w:t>Kế hoạch triển khai xuyên suốt 15 tuần học kỳ theo tiến độ của Nhà trường, kèm mốc đánh giá tiến độ nội bộ vào Tuần 8:</w:t>
+        <w:t>Kế hoạch triển khai cấp tốc trong 7 ngày theo chuẩn mực của Bộ môn Khoa học Dữ liệu - Khoa CNTT - HUIT, đảm bảo khối lượng thực nghiệm và tính toàn diện của đồ án:</w:t>
       </w:r>
     </w:p>
     <w:tbl>
@@ -6231,7 +6231,7 @@
                 <w:b/>
                 <w:sz w:val="20"/>
               </w:rPr>
-              <w:t>Tuần</w:t>
+              <w:t>Ngày</w:t>
             </w:r>
           </w:p>
         </w:tc>
@@ -6256,7 +6256,7 @@
                 <w:b/>
                 <w:sz w:val="20"/>
               </w:rPr>
-              <w:t>Nội dung công việc chuẩn HUIT</w:t>
+              <w:t>Nội dung công việc trọng tâm</w:t>
             </w:r>
           </w:p>
         </w:tc>
@@ -6357,7 +6357,7 @@
                 <w:b/>
                 <w:sz w:val="20"/>
               </w:rPr>
-              <w:t>Tuần 1</w:t>
+              <w:t>Ngày 1</w:t>
             </w:r>
           </w:p>
         </w:tc>
@@ -6380,7 +6380,7 @@
                 <w:rFonts w:ascii="Times New Roman" w:hAnsi="Times New Roman"/>
                 <w:sz w:val="20"/>
               </w:rPr>
-              <w:t>Đăng ký đề tài, phân công vai trò, lập kế hoạch 15 tuần</w:t>
+              <w:t>Khởi động Sprint, Chuẩn hóa Dữ liệu &amp; Đặc tả Kỹ thuật</w:t>
             </w:r>
           </w:p>
         </w:tc>
@@ -6403,7 +6403,7 @@
                 <w:rFonts w:ascii="Times New Roman" w:hAnsi="Times New Roman"/>
                 <w:sz w:val="20"/>
               </w:rPr>
-              <w:t>Chủ trì đăng ký đề tài, lập kế hoạch chi tiết</w:t>
+              <w:t>Chủ trì lập kế hoạch Sprint 7 ngày, soạn thảo đặc tả SPEC_PIPELINE_MRI.md (13 signatures, 7 invariants)</w:t>
             </w:r>
           </w:p>
         </w:tc>
@@ -6426,7 +6426,7 @@
                 <w:rFonts w:ascii="Times New Roman" w:hAnsi="Times New Roman"/>
                 <w:sz w:val="20"/>
               </w:rPr>
-              <w:t>Thống nhất vai trò, thiết lập môi trường Git</w:t>
+              <w:t>Tổ chức cấu trúc dữ liệu 2 tầng (sample/full 3,929 lát), chạy Notebook 01 EDA, xuất DATA_EXPLORATION_REPORT.md</w:t>
             </w:r>
           </w:p>
         </w:tc>
@@ -6449,7 +6449,7 @@
                 <w:rFonts w:ascii="Times New Roman" w:hAnsi="Times New Roman"/>
                 <w:sz w:val="20"/>
               </w:rPr>
-              <w:t>Bản phân công và kế hoạch làm việc</w:t>
+              <w:t>SPEC_PIPELINE_MRI.md, Notebook 01, Báo cáo dữ liệu</w:t>
             </w:r>
           </w:p>
         </w:tc>
@@ -6475,7 +6475,7 @@
                 <w:b/>
                 <w:sz w:val="20"/>
               </w:rPr>
-              <w:t>Tuần 2–3</w:t>
+              <w:t>Ngày 2</w:t>
             </w:r>
           </w:p>
         </w:tc>
@@ -6498,7 +6498,7 @@
                 <w:rFonts w:ascii="Times New Roman" w:hAnsi="Times New Roman"/>
                 <w:sz w:val="20"/>
               </w:rPr>
-              <w:t>Nghiên cứu cơ sở lý thuyết DIP và quy trình xử lý</w:t>
+              <w:t>Tiền xử lý, Tách sọ não 6 bước &amp; Bộ đo Y sinh</w:t>
             </w:r>
           </w:p>
         </w:tc>
@@ -6521,7 +6521,7 @@
                 <w:rFonts w:ascii="Times New Roman" w:hAnsi="Times New Roman"/>
                 <w:sz w:val="20"/>
               </w:rPr>
-              <w:t>Lý thuyết lọc Bilateral, Skull Stripping, Watershed; soạn SPEC</w:t>
+              <w:t>Cài đặt filters.py (Bilateral + CLAHE), skull_strip.py 6 bước kinh điển, hoàn thiện Notebook 02</w:t>
             </w:r>
           </w:p>
         </w:tc>
@@ -6544,7 +6544,7 @@
                 <w:rFonts w:ascii="Times New Roman" w:hAnsi="Times New Roman"/>
                 <w:sz w:val="20"/>
               </w:rPr>
-              <w:t>Lý thuyết các chỉ số đánh giá y tế: Dice, IoU, Sens, Spec</w:t>
+              <w:t>Cài đặt module metrics.py (Dice, IoU, Sens, Spec), xử lý an toàn mẫu rỗng 0/0, viết test unit</w:t>
             </w:r>
           </w:p>
         </w:tc>
@@ -6567,7 +6567,7 @@
                 <w:rFonts w:ascii="Times New Roman" w:hAnsi="Times New Roman"/>
                 <w:sz w:val="20"/>
               </w:rPr>
-              <w:t>SPEC_PIPELINE_MRI.md, Sơ đồ khối pipeline</w:t>
+              <w:t>src/preprocessing/, src/evaluation/metrics.py, Unit tests (test_preprocessing, test_metrics)</w:t>
             </w:r>
           </w:p>
         </w:tc>
@@ -6593,7 +6593,7 @@
                 <w:b/>
                 <w:sz w:val="20"/>
               </w:rPr>
-              <w:t>Tuần 4</w:t>
+              <w:t>Ngày 3</w:t>
             </w:r>
           </w:p>
         </w:tc>
@@ -6616,7 +6616,7 @@
                 <w:rFonts w:ascii="Times New Roman" w:hAnsi="Times New Roman"/>
                 <w:sz w:val="20"/>
               </w:rPr>
-              <w:t>Thu thập, chuẩn hóa và kiểm tra dữ liệu</w:t>
+              <w:t>Phân đoạn Baseline Watershed &amp; Đo Đặc trưng Hình học</w:t>
             </w:r>
           </w:p>
         </w:tc>
@@ -6639,7 +6639,7 @@
                 <w:rFonts w:ascii="Times New Roman" w:hAnsi="Times New Roman"/>
                 <w:sz w:val="20"/>
               </w:rPr>
-              <w:t>Rà soát chất lượng ảnh MRI và quy cách nhãn</w:t>
+              <w:t>Cài đặt watershed.py với biến đổi khoảng cách EDT, khảo sát ngưỡng dist_thresh_ratio</w:t>
             </w:r>
           </w:p>
         </w:tc>
@@ -6662,7 +6662,7 @@
                 <w:rFonts w:ascii="Times New Roman" w:hAnsi="Times New Roman"/>
                 <w:sz w:val="20"/>
               </w:rPr>
-              <w:t>Tổ chức cấu trúc 2 tầng dữ liệu, viết Notebook 01, xuất báo cáo dữ liệu</w:t>
+              <w:t>Cài đặt features.py (diện tích u, circularity, bounding box) và visualization.py (hộp đỏ, viền vàng, Quad view)</w:t>
             </w:r>
           </w:p>
         </w:tc>
@@ -6685,7 +6685,7 @@
                 <w:rFonts w:ascii="Times New Roman" w:hAnsi="Times New Roman"/>
                 <w:sz w:val="20"/>
               </w:rPr>
-              <w:t>data/sample, data/full, DATA_EXPLORATION_REPORT.md</w:t>
+              <w:t>src/segmentation/watershed.py, src/measurement/, Unit tests (test_segmentation, test_measurement)</w:t>
             </w:r>
           </w:p>
         </w:tc>
@@ -6711,7 +6711,7 @@
                 <w:b/>
                 <w:sz w:val="20"/>
               </w:rPr>
-              <w:t>Tuần 5</w:t>
+              <w:t>Ngày 4</w:t>
             </w:r>
           </w:p>
         </w:tc>
@@ -6734,7 +6734,7 @@
                 <w:rFonts w:ascii="Times New Roman" w:hAnsi="Times New Roman"/>
                 <w:sz w:val="20"/>
               </w:rPr>
-              <w:t>Cài đặt module Tiền xử lý &amp; Tách sọ não</w:t>
+              <w:t>Phân đoạn Đối chứng Region Growing &amp; Ghép nối Pipeline</w:t>
             </w:r>
           </w:p>
         </w:tc>
@@ -6757,7 +6757,7 @@
                 <w:rFonts w:ascii="Times New Roman" w:hAnsi="Times New Roman"/>
                 <w:sz w:val="20"/>
               </w:rPr>
-              <w:t>Cài đặt filters.py, skull_strip.py, viết Notebook 02</w:t>
+              <w:t>Cài đặt region_growing.py (tự tìm seed cực đại cường độ, BFS 8 láng giềng), tích hợp BrainTumorPipeline</w:t>
             </w:r>
           </w:p>
         </w:tc>
@@ -6780,7 +6780,7 @@
                 <w:rFonts w:ascii="Times New Roman" w:hAnsi="Times New Roman"/>
                 <w:sz w:val="20"/>
               </w:rPr>
-              <w:t>Phối hợp kiểm thử trên các ca có nhiễu sọc và tương phản thấp</w:t>
+              <w:t>Hoàn thiện Notebook 03 (so sánh song song Watershed vs Region Growing), xây dựng framework benchmark</w:t>
             </w:r>
           </w:p>
         </w:tc>
@@ -6803,7 +6803,7 @@
                 <w:rFonts w:ascii="Times New Roman" w:hAnsi="Times New Roman"/>
                 <w:sz w:val="20"/>
               </w:rPr>
-              <w:t>src/preprocessing/, Notebook 02, Bộ ảnh 6 bước tách sọ</w:t>
+              <w:t>src/pipeline.py, Notebook 03, Bảng nhận xét định tính</w:t>
             </w:r>
           </w:p>
         </w:tc>
@@ -6829,7 +6829,7 @@
                 <w:b/>
                 <w:sz w:val="20"/>
               </w:rPr>
-              <w:t>Tuần 6</w:t>
+              <w:t>Ngày 5</w:t>
             </w:r>
           </w:p>
         </w:tc>
@@ -6852,7 +6852,7 @@
                 <w:rFonts w:ascii="Times New Roman" w:hAnsi="Times New Roman"/>
                 <w:sz w:val="20"/>
               </w:rPr>
-              <w:t>Cài đặt phương pháp chính 1 (Baseline Watershed)</w:t>
+              <w:t>Benchmark Quy mô lớn (3,929 lát cắt) &amp; Web Demo GUI</w:t>
             </w:r>
           </w:p>
         </w:tc>
@@ -6875,7 +6875,7 @@
                 <w:rFonts w:ascii="Times New Roman" w:hAnsi="Times New Roman"/>
                 <w:sz w:val="20"/>
               </w:rPr>
-              <w:t>Cài đặt watershed.py và Distance Transform</w:t>
+              <w:t>Phân tích chuyên sâu các ca thất bại (Failure cases: u nhỏ &lt;1.5%, u biên mờ, u chèn ép não thất)</w:t>
             </w:r>
           </w:p>
         </w:tc>
@@ -6898,7 +6898,7 @@
                 <w:rFonts w:ascii="Times New Roman" w:hAnsi="Times New Roman"/>
                 <w:sz w:val="20"/>
               </w:rPr>
-              <w:t>Cài đặt module bộ đo y tế metrics.py và Unit tests</w:t>
+              <w:t>Hoàn thiện Streamlit GUI (demo/app.py) Dual-mode, chạy benchmark đa tiến trình 3,929 lát cắt và Notebook 04</w:t>
             </w:r>
           </w:p>
         </w:tc>
@@ -6921,7 +6921,7 @@
                 <w:rFonts w:ascii="Times New Roman" w:hAnsi="Times New Roman"/>
                 <w:sz w:val="20"/>
               </w:rPr>
-              <w:t>src/segmentation/watershed.py, src/evaluation/metrics.py</w:t>
+              <w:t>BENCHMARK_RESULTS.csv, Notebook 04, Streamlit Web App</w:t>
             </w:r>
           </w:p>
         </w:tc>
@@ -6947,7 +6947,7 @@
                 <w:b/>
                 <w:sz w:val="20"/>
               </w:rPr>
-              <w:t>Tuần 7</w:t>
+              <w:t>Ngày 6</w:t>
             </w:r>
           </w:p>
         </w:tc>
@@ -6970,7 +6970,7 @@
                 <w:rFonts w:ascii="Times New Roman" w:hAnsi="Times New Roman"/>
                 <w:sz w:val="20"/>
               </w:rPr>
-              <w:t>Hoàn thiện pipeline cơ sở từ ảnh thô đến u não</w:t>
+              <w:t>Biên soạn Toàn văn Báo cáo Đồ án 12 Mục chuẩn HUIT</w:t>
             </w:r>
           </w:p>
         </w:tc>
@@ -6993,7 +6993,7 @@
                 <w:rFonts w:ascii="Times New Roman" w:hAnsi="Times New Roman"/>
                 <w:sz w:val="20"/>
               </w:rPr>
-              <w:t>Xây dựng lớp điều phối BrainTumorPipeline</w:t>
+              <w:t>Soạn thảo 4 chương kỹ thuật (Mục 2: Lý thuyết; Mục 4: Tiền xử lý &amp; Sọ; Mục 6: Thực nghiệm; Mục 8: Kỹ thuật)</w:t>
             </w:r>
           </w:p>
         </w:tc>
@@ -7016,7 +7016,7 @@
                 <w:rFonts w:ascii="Times New Roman" w:hAnsi="Times New Roman"/>
                 <w:sz w:val="20"/>
               </w:rPr>
-              <w:t>Đo lường thử nghiệm trên kết quả baseline</w:t>
+              <w:t>Soạn thảo 6 chương tổng quan (Mục 1: Mở đầu; Mục 3: Dữ liệu; Mục 5: Chỉ số; Mục 8: Số liệu; Mục 9: GUI; Mục 10: Kết luận)</w:t>
             </w:r>
           </w:p>
         </w:tc>
@@ -7039,7 +7039,7 @@
                 <w:rFonts w:ascii="Times New Roman" w:hAnsi="Times New Roman"/>
                 <w:sz w:val="20"/>
               </w:rPr>
-              <w:t>src/pipeline.py chạy ổn định</w:t>
+              <w:t>BAO_CAO_DO_AN_XLAS.md, BAO_CAO_DO_AN_XLAS.docx (Word chuẩn lề 3-3-3-2 cm)</w:t>
             </w:r>
           </w:p>
         </w:tc>
@@ -7065,7 +7065,7 @@
                 <w:b/>
                 <w:sz w:val="20"/>
               </w:rPr>
-              <w:t>Tuần 8</w:t>
+              <w:t>Ngày 7</w:t>
             </w:r>
           </w:p>
         </w:tc>
@@ -7086,10 +7086,9 @@
             <w:r>
               <w:rPr>
                 <w:rFonts w:ascii="Times New Roman" w:hAnsi="Times New Roman"/>
-                <w:b/>
                 <w:sz w:val="20"/>
               </w:rPr>
-              <w:t>BÁO CÁO TIẾN ĐỘ NỘI BỘ VỚI GIẢNG VIÊN</w:t>
+              <w:t>Chuẩn hóa Mã nguồn, Slide Thuyết trình, Video Demo &amp; Đóng gói</w:t>
             </w:r>
           </w:p>
         </w:tc>
@@ -7110,10 +7109,9 @@
             <w:r>
               <w:rPr>
                 <w:rFonts w:ascii="Times New Roman" w:hAnsi="Times New Roman"/>
-                <w:b/>
                 <w:sz w:val="20"/>
               </w:rPr>
-              <w:t>Soạn nội dung kỹ thuật, báo cáo trực tiếp với GV</w:t>
+              <w:t>Rà soát toàn bộ code src/, bổ sung 100% docstring tiếng Việt, bảo đảm 12/12 unit tests PASSED</w:t>
             </w:r>
           </w:p>
         </w:tc>
@@ -7134,10 +7132,9 @@
             <w:r>
               <w:rPr>
                 <w:rFonts w:ascii="Times New Roman" w:hAnsi="Times New Roman"/>
-                <w:b/>
                 <w:sz w:val="20"/>
               </w:rPr>
-              <w:t>Tổng hợp số liệu và hình ảnh minh họa baseline</w:t>
+              <w:t>Thiết kế bộ Slide 20 trang (SLIDE_THUYET_TRINH_OUTLINE.md), quay Video demo 3 phút, đóng gói ZIP trọn bộ hồ sơ</w:t>
             </w:r>
           </w:p>
         </w:tc>
@@ -7158,10 +7155,9 @@
             <w:r>
               <w:rPr>
                 <w:rFonts w:ascii="Times New Roman" w:hAnsi="Times New Roman"/>
-                <w:b/>
                 <w:sz w:val="20"/>
               </w:rPr>
-              <w:t>Báo cáo tiến độ nội bộ hoàn thành</w:t>
+              <w:t>Slide PPTX/PDF, Video Demo MP4, Bộ mã nguồn sạch, Hồ sơ nộp hoàn chỉnh</w:t>
             </w:r>
           </w:p>
         </w:tc>
@@ -7187,715 +7183,7 @@
                 <w:b/>
                 <w:sz w:val="20"/>
               </w:rPr>
-              <w:t>Tuần 9</w:t>
-            </w:r>
-          </w:p>
-        </w:tc>
-        <w:tc>
-          <w:tcPr>
-            <w:tcW w:type="dxa" w:w="1814"/>
-            <w:tcMar>
-              <w:top w:w="60" w:type="dxa"/>
-              <w:left w:w="60" w:type="dxa"/>
-              <w:bottom w:w="60" w:type="dxa"/>
-              <w:right w:w="60" w:type="dxa"/>
-            </w:tcMar>
-          </w:tcPr>
-          <w:p>
-            <w:pPr>
-              <w:jc w:val="left"/>
-            </w:pPr>
-            <w:r>
-              <w:rPr>
-                <w:rFonts w:ascii="Times New Roman" w:hAnsi="Times New Roman"/>
-                <w:sz w:val="20"/>
-              </w:rPr>
-              <w:t>Cài đặt phương pháp đối chứng 2 (Region Growing)</w:t>
-            </w:r>
-          </w:p>
-        </w:tc>
-        <w:tc>
-          <w:tcPr>
-            <w:tcW w:type="dxa" w:w="1814"/>
-            <w:tcMar>
-              <w:top w:w="60" w:type="dxa"/>
-              <w:left w:w="60" w:type="dxa"/>
-              <w:bottom w:w="60" w:type="dxa"/>
-              <w:right w:w="60" w:type="dxa"/>
-            </w:tcMar>
-          </w:tcPr>
-          <w:p>
-            <w:pPr>
-              <w:jc w:val="left"/>
-            </w:pPr>
-            <w:r>
-              <w:rPr>
-                <w:rFonts w:ascii="Times New Roman" w:hAnsi="Times New Roman"/>
-                <w:sz w:val="20"/>
-              </w:rPr>
-              <w:t>Cài đặt region_growing.py, khảo sát tham số tolerance</w:t>
-            </w:r>
-          </w:p>
-        </w:tc>
-        <w:tc>
-          <w:tcPr>
-            <w:tcW w:type="dxa" w:w="1814"/>
-            <w:tcMar>
-              <w:top w:w="60" w:type="dxa"/>
-              <w:left w:w="60" w:type="dxa"/>
-              <w:bottom w:w="60" w:type="dxa"/>
-              <w:right w:w="60" w:type="dxa"/>
-            </w:tcMar>
-          </w:tcPr>
-          <w:p>
-            <w:pPr>
-              <w:jc w:val="left"/>
-            </w:pPr>
-            <w:r>
-              <w:rPr>
-                <w:rFonts w:ascii="Times New Roman" w:hAnsi="Times New Roman"/>
-                <w:sz w:val="20"/>
-              </w:rPr>
-              <w:t>Xây dựng module tự động hóa benchmark benchmark.py</w:t>
-            </w:r>
-          </w:p>
-        </w:tc>
-        <w:tc>
-          <w:tcPr>
-            <w:tcW w:type="dxa" w:w="1814"/>
-            <w:tcMar>
-              <w:top w:w="60" w:type="dxa"/>
-              <w:left w:w="60" w:type="dxa"/>
-              <w:bottom w:w="60" w:type="dxa"/>
-              <w:right w:w="60" w:type="dxa"/>
-            </w:tcMar>
-          </w:tcPr>
-          <w:p>
-            <w:pPr>
-              <w:jc w:val="left"/>
-            </w:pPr>
-            <w:r>
-              <w:rPr>
-                <w:rFonts w:ascii="Times New Roman" w:hAnsi="Times New Roman"/>
-                <w:sz w:val="20"/>
-              </w:rPr>
-              <w:t>src/segmentation/region_growing.py, Notebook 03</w:t>
-            </w:r>
-          </w:p>
-        </w:tc>
-      </w:tr>
-      <w:tr>
-        <w:tc>
-          <w:tcPr>
-            <w:tcW w:type="dxa" w:w="1814"/>
-            <w:tcMar>
-              <w:top w:w="60" w:type="dxa"/>
-              <w:left w:w="60" w:type="dxa"/>
-              <w:bottom w:w="60" w:type="dxa"/>
-              <w:right w:w="60" w:type="dxa"/>
-            </w:tcMar>
-          </w:tcPr>
-          <w:p>
-            <w:pPr>
-              <w:jc w:val="center"/>
-            </w:pPr>
-            <w:r>
-              <w:rPr>
-                <w:rFonts w:ascii="Times New Roman" w:hAnsi="Times New Roman"/>
-                <w:b/>
-                <w:sz w:val="20"/>
-              </w:rPr>
-              <w:t>Tuần 10</w:t>
-            </w:r>
-          </w:p>
-        </w:tc>
-        <w:tc>
-          <w:tcPr>
-            <w:tcW w:type="dxa" w:w="1814"/>
-            <w:tcMar>
-              <w:top w:w="60" w:type="dxa"/>
-              <w:left w:w="60" w:type="dxa"/>
-              <w:bottom w:w="60" w:type="dxa"/>
-              <w:right w:w="60" w:type="dxa"/>
-            </w:tcMar>
-          </w:tcPr>
-          <w:p>
-            <w:pPr>
-              <w:jc w:val="left"/>
-            </w:pPr>
-            <w:r>
-              <w:rPr>
-                <w:rFonts w:ascii="Times New Roman" w:hAnsi="Times New Roman"/>
-                <w:sz w:val="20"/>
-              </w:rPr>
-              <w:t>Rút trích đặc trưng hình học &amp; Khớp nối hệ thống</w:t>
-            </w:r>
-          </w:p>
-        </w:tc>
-        <w:tc>
-          <w:tcPr>
-            <w:tcW w:type="dxa" w:w="1814"/>
-            <w:tcMar>
-              <w:top w:w="60" w:type="dxa"/>
-              <w:left w:w="60" w:type="dxa"/>
-              <w:bottom w:w="60" w:type="dxa"/>
-              <w:right w:w="60" w:type="dxa"/>
-            </w:tcMar>
-          </w:tcPr>
-          <w:p>
-            <w:pPr>
-              <w:jc w:val="left"/>
-            </w:pPr>
-            <w:r>
-              <w:rPr>
-                <w:rFonts w:ascii="Times New Roman" w:hAnsi="Times New Roman"/>
-                <w:sz w:val="20"/>
-              </w:rPr>
-              <w:t>Tối ưu hóa hậu xử lý hình thái học</w:t>
-            </w:r>
-          </w:p>
-        </w:tc>
-        <w:tc>
-          <w:tcPr>
-            <w:tcW w:type="dxa" w:w="1814"/>
-            <w:tcMar>
-              <w:top w:w="60" w:type="dxa"/>
-              <w:left w:w="60" w:type="dxa"/>
-              <w:bottom w:w="60" w:type="dxa"/>
-              <w:right w:w="60" w:type="dxa"/>
-            </w:tcMar>
-          </w:tcPr>
-          <w:p>
-            <w:pPr>
-              <w:jc w:val="left"/>
-            </w:pPr>
-            <w:r>
-              <w:rPr>
-                <w:rFonts w:ascii="Times New Roman" w:hAnsi="Times New Roman"/>
-                <w:sz w:val="20"/>
-              </w:rPr>
-              <w:t>Cài đặt features.py (diện tích, độ tròn) và visualization.py</w:t>
-            </w:r>
-          </w:p>
-        </w:tc>
-        <w:tc>
-          <w:tcPr>
-            <w:tcW w:type="dxa" w:w="1814"/>
-            <w:tcMar>
-              <w:top w:w="60" w:type="dxa"/>
-              <w:left w:w="60" w:type="dxa"/>
-              <w:bottom w:w="60" w:type="dxa"/>
-              <w:right w:w="60" w:type="dxa"/>
-            </w:tcMar>
-          </w:tcPr>
-          <w:p>
-            <w:pPr>
-              <w:jc w:val="left"/>
-            </w:pPr>
-            <w:r>
-              <w:rPr>
-                <w:rFonts w:ascii="Times New Roman" w:hAnsi="Times New Roman"/>
-                <w:sz w:val="20"/>
-              </w:rPr>
-              <w:t>src/measurement/, Bounding box màu đỏ</w:t>
-            </w:r>
-          </w:p>
-        </w:tc>
-      </w:tr>
-      <w:tr>
-        <w:tc>
-          <w:tcPr>
-            <w:tcW w:type="dxa" w:w="1814"/>
-            <w:tcMar>
-              <w:top w:w="60" w:type="dxa"/>
-              <w:left w:w="60" w:type="dxa"/>
-              <w:bottom w:w="60" w:type="dxa"/>
-              <w:right w:w="60" w:type="dxa"/>
-            </w:tcMar>
-          </w:tcPr>
-          <w:p>
-            <w:pPr>
-              <w:jc w:val="center"/>
-            </w:pPr>
-            <w:r>
-              <w:rPr>
-                <w:rFonts w:ascii="Times New Roman" w:hAnsi="Times New Roman"/>
-                <w:b/>
-                <w:sz w:val="20"/>
-              </w:rPr>
-              <w:t>Tuần 11</w:t>
-            </w:r>
-          </w:p>
-        </w:tc>
-        <w:tc>
-          <w:tcPr>
-            <w:tcW w:type="dxa" w:w="1814"/>
-            <w:tcMar>
-              <w:top w:w="60" w:type="dxa"/>
-              <w:left w:w="60" w:type="dxa"/>
-              <w:bottom w:w="60" w:type="dxa"/>
-              <w:right w:w="60" w:type="dxa"/>
-            </w:tcMar>
-          </w:tcPr>
-          <w:p>
-            <w:pPr>
-              <w:jc w:val="left"/>
-            </w:pPr>
-            <w:r>
-              <w:rPr>
-                <w:rFonts w:ascii="Times New Roman" w:hAnsi="Times New Roman"/>
-                <w:sz w:val="20"/>
-              </w:rPr>
-              <w:t>Tích hợp ứng dụng minh họa tương tác hoàn chỉnh</w:t>
-            </w:r>
-          </w:p>
-        </w:tc>
-        <w:tc>
-          <w:tcPr>
-            <w:tcW w:type="dxa" w:w="1814"/>
-            <w:tcMar>
-              <w:top w:w="60" w:type="dxa"/>
-              <w:left w:w="60" w:type="dxa"/>
-              <w:bottom w:w="60" w:type="dxa"/>
-              <w:right w:w="60" w:type="dxa"/>
-            </w:tcMar>
-          </w:tcPr>
-          <w:p>
-            <w:pPr>
-              <w:jc w:val="left"/>
-            </w:pPr>
-            <w:r>
-              <w:rPr>
-                <w:rFonts w:ascii="Times New Roman" w:hAnsi="Times New Roman"/>
-                <w:sz w:val="20"/>
-              </w:rPr>
-              <w:t>Hỗ trợ tích hợp pipeline vào ứng dụng</w:t>
-            </w:r>
-          </w:p>
-        </w:tc>
-        <w:tc>
-          <w:tcPr>
-            <w:tcW w:type="dxa" w:w="1814"/>
-            <w:tcMar>
-              <w:top w:w="60" w:type="dxa"/>
-              <w:left w:w="60" w:type="dxa"/>
-              <w:bottom w:w="60" w:type="dxa"/>
-              <w:right w:w="60" w:type="dxa"/>
-            </w:tcMar>
-          </w:tcPr>
-          <w:p>
-            <w:pPr>
-              <w:jc w:val="left"/>
-            </w:pPr>
-            <w:r>
-              <w:rPr>
-                <w:rFonts w:ascii="Times New Roman" w:hAnsi="Times New Roman"/>
-                <w:sz w:val="20"/>
-              </w:rPr>
-              <w:t>Xây dựng và hoàn thiện giao diện Streamlit GUI (app.py)</w:t>
-            </w:r>
-          </w:p>
-        </w:tc>
-        <w:tc>
-          <w:tcPr>
-            <w:tcW w:type="dxa" w:w="1814"/>
-            <w:tcMar>
-              <w:top w:w="60" w:type="dxa"/>
-              <w:left w:w="60" w:type="dxa"/>
-              <w:bottom w:w="60" w:type="dxa"/>
-              <w:right w:w="60" w:type="dxa"/>
-            </w:tcMar>
-          </w:tcPr>
-          <w:p>
-            <w:pPr>
-              <w:jc w:val="left"/>
-            </w:pPr>
-            <w:r>
-              <w:rPr>
-                <w:rFonts w:ascii="Times New Roman" w:hAnsi="Times New Roman"/>
-                <w:sz w:val="20"/>
-              </w:rPr>
-              <w:t>Ứng dụng web Streamlit chạy mượt mà</w:t>
-            </w:r>
-          </w:p>
-        </w:tc>
-      </w:tr>
-      <w:tr>
-        <w:tc>
-          <w:tcPr>
-            <w:tcW w:type="dxa" w:w="1814"/>
-            <w:tcMar>
-              <w:top w:w="60" w:type="dxa"/>
-              <w:left w:w="60" w:type="dxa"/>
-              <w:bottom w:w="60" w:type="dxa"/>
-              <w:right w:w="60" w:type="dxa"/>
-            </w:tcMar>
-          </w:tcPr>
-          <w:p>
-            <w:pPr>
-              <w:jc w:val="center"/>
-            </w:pPr>
-            <w:r>
-              <w:rPr>
-                <w:rFonts w:ascii="Times New Roman" w:hAnsi="Times New Roman"/>
-                <w:b/>
-                <w:sz w:val="20"/>
-              </w:rPr>
-              <w:t>Tuần 12</w:t>
-            </w:r>
-          </w:p>
-        </w:tc>
-        <w:tc>
-          <w:tcPr>
-            <w:tcW w:type="dxa" w:w="1814"/>
-            <w:tcMar>
-              <w:top w:w="60" w:type="dxa"/>
-              <w:left w:w="60" w:type="dxa"/>
-              <w:bottom w:w="60" w:type="dxa"/>
-              <w:right w:w="60" w:type="dxa"/>
-            </w:tcMar>
-          </w:tcPr>
-          <w:p>
-            <w:pPr>
-              <w:jc w:val="left"/>
-            </w:pPr>
-            <w:r>
-              <w:rPr>
-                <w:rFonts w:ascii="Times New Roman" w:hAnsi="Times New Roman"/>
-                <w:sz w:val="20"/>
-              </w:rPr>
-              <w:t>Đánh giá định lượng quy mô lớn (3,929 lát cắt)</w:t>
-            </w:r>
-          </w:p>
-        </w:tc>
-        <w:tc>
-          <w:tcPr>
-            <w:tcW w:type="dxa" w:w="1814"/>
-            <w:tcMar>
-              <w:top w:w="60" w:type="dxa"/>
-              <w:left w:w="60" w:type="dxa"/>
-              <w:bottom w:w="60" w:type="dxa"/>
-              <w:right w:w="60" w:type="dxa"/>
-            </w:tcMar>
-          </w:tcPr>
-          <w:p>
-            <w:pPr>
-              <w:jc w:val="left"/>
-            </w:pPr>
-            <w:r>
-              <w:rPr>
-                <w:rFonts w:ascii="Times New Roman" w:hAnsi="Times New Roman"/>
-                <w:sz w:val="20"/>
-              </w:rPr>
-              <w:t>Phân tích chuyên sâu các ca thất bại (Failure cases)</w:t>
-            </w:r>
-          </w:p>
-        </w:tc>
-        <w:tc>
-          <w:tcPr>
-            <w:tcW w:type="dxa" w:w="1814"/>
-            <w:tcMar>
-              <w:top w:w="60" w:type="dxa"/>
-              <w:left w:w="60" w:type="dxa"/>
-              <w:bottom w:w="60" w:type="dxa"/>
-              <w:right w:w="60" w:type="dxa"/>
-            </w:tcMar>
-          </w:tcPr>
-          <w:p>
-            <w:pPr>
-              <w:jc w:val="left"/>
-            </w:pPr>
-            <w:r>
-              <w:rPr>
-                <w:rFonts w:ascii="Times New Roman" w:hAnsi="Times New Roman"/>
-                <w:sz w:val="20"/>
-              </w:rPr>
-              <w:t>Chạy thực nghiệm 3,929 lát, vẽ biểu đồ so sánh, viết Notebook 04</w:t>
-            </w:r>
-          </w:p>
-        </w:tc>
-        <w:tc>
-          <w:tcPr>
-            <w:tcW w:type="dxa" w:w="1814"/>
-            <w:tcMar>
-              <w:top w:w="60" w:type="dxa"/>
-              <w:left w:w="60" w:type="dxa"/>
-              <w:bottom w:w="60" w:type="dxa"/>
-              <w:right w:w="60" w:type="dxa"/>
-            </w:tcMar>
-          </w:tcPr>
-          <w:p>
-            <w:pPr>
-              <w:jc w:val="left"/>
-            </w:pPr>
-            <w:r>
-              <w:rPr>
-                <w:rFonts w:ascii="Times New Roman" w:hAnsi="Times New Roman"/>
-                <w:sz w:val="20"/>
-              </w:rPr>
-              <w:t>BENCHMARK_RESULTS.csv, Notebook 04</w:t>
-            </w:r>
-          </w:p>
-        </w:tc>
-      </w:tr>
-      <w:tr>
-        <w:tc>
-          <w:tcPr>
-            <w:tcW w:type="dxa" w:w="1814"/>
-            <w:tcMar>
-              <w:top w:w="60" w:type="dxa"/>
-              <w:left w:w="60" w:type="dxa"/>
-              <w:bottom w:w="60" w:type="dxa"/>
-              <w:right w:w="60" w:type="dxa"/>
-            </w:tcMar>
-          </w:tcPr>
-          <w:p>
-            <w:pPr>
-              <w:jc w:val="center"/>
-            </w:pPr>
-            <w:r>
-              <w:rPr>
-                <w:rFonts w:ascii="Times New Roman" w:hAnsi="Times New Roman"/>
-                <w:b/>
-                <w:sz w:val="20"/>
-              </w:rPr>
-              <w:t>Tuần 13</w:t>
-            </w:r>
-          </w:p>
-        </w:tc>
-        <w:tc>
-          <w:tcPr>
-            <w:tcW w:type="dxa" w:w="1814"/>
-            <w:tcMar>
-              <w:top w:w="60" w:type="dxa"/>
-              <w:left w:w="60" w:type="dxa"/>
-              <w:bottom w:w="60" w:type="dxa"/>
-              <w:right w:w="60" w:type="dxa"/>
-            </w:tcMar>
-          </w:tcPr>
-          <w:p>
-            <w:pPr>
-              <w:jc w:val="left"/>
-            </w:pPr>
-            <w:r>
-              <w:rPr>
-                <w:rFonts w:ascii="Times New Roman" w:hAnsi="Times New Roman"/>
-                <w:sz w:val="20"/>
-              </w:rPr>
-              <w:t>Biên soạn bản nháp Báo cáo đồ án</w:t>
-            </w:r>
-          </w:p>
-        </w:tc>
-        <w:tc>
-          <w:tcPr>
-            <w:tcW w:type="dxa" w:w="1814"/>
-            <w:tcMar>
-              <w:top w:w="60" w:type="dxa"/>
-              <w:left w:w="60" w:type="dxa"/>
-              <w:bottom w:w="60" w:type="dxa"/>
-              <w:right w:w="60" w:type="dxa"/>
-            </w:tcMar>
-          </w:tcPr>
-          <w:p>
-            <w:pPr>
-              <w:jc w:val="left"/>
-            </w:pPr>
-            <w:r>
-              <w:rPr>
-                <w:rFonts w:ascii="Times New Roman" w:hAnsi="Times New Roman"/>
-                <w:sz w:val="20"/>
-              </w:rPr>
-              <w:t>Soạn thảo 4 chương kỹ thuật (Mục 4, 6, 7, 8 kỹ thuật)</w:t>
-            </w:r>
-          </w:p>
-        </w:tc>
-        <w:tc>
-          <w:tcPr>
-            <w:tcW w:type="dxa" w:w="1814"/>
-            <w:tcMar>
-              <w:top w:w="60" w:type="dxa"/>
-              <w:left w:w="60" w:type="dxa"/>
-              <w:bottom w:w="60" w:type="dxa"/>
-              <w:right w:w="60" w:type="dxa"/>
-            </w:tcMar>
-          </w:tcPr>
-          <w:p>
-            <w:pPr>
-              <w:jc w:val="left"/>
-            </w:pPr>
-            <w:r>
-              <w:rPr>
-                <w:rFonts w:ascii="Times New Roman" w:hAnsi="Times New Roman"/>
-                <w:sz w:val="20"/>
-              </w:rPr>
-              <w:t>Soạn thảo 6 chương tổng quan (Mục 3, 5, 8 số liệu, 9, 10, bìa)</w:t>
-            </w:r>
-          </w:p>
-        </w:tc>
-        <w:tc>
-          <w:tcPr>
-            <w:tcW w:type="dxa" w:w="1814"/>
-            <w:tcMar>
-              <w:top w:w="60" w:type="dxa"/>
-              <w:left w:w="60" w:type="dxa"/>
-              <w:bottom w:w="60" w:type="dxa"/>
-              <w:right w:w="60" w:type="dxa"/>
-            </w:tcMar>
-          </w:tcPr>
-          <w:p>
-            <w:pPr>
-              <w:jc w:val="left"/>
-            </w:pPr>
-            <w:r>
-              <w:rPr>
-                <w:rFonts w:ascii="Times New Roman" w:hAnsi="Times New Roman"/>
-                <w:sz w:val="20"/>
-              </w:rPr>
-              <w:t>Bản nháp báo cáo đầy đủ 12 mục</w:t>
-            </w:r>
-          </w:p>
-        </w:tc>
-      </w:tr>
-      <w:tr>
-        <w:tc>
-          <w:tcPr>
-            <w:tcW w:type="dxa" w:w="1814"/>
-            <w:tcMar>
-              <w:top w:w="60" w:type="dxa"/>
-              <w:left w:w="60" w:type="dxa"/>
-              <w:bottom w:w="60" w:type="dxa"/>
-              <w:right w:w="60" w:type="dxa"/>
-            </w:tcMar>
-          </w:tcPr>
-          <w:p>
-            <w:pPr>
-              <w:jc w:val="center"/>
-            </w:pPr>
-            <w:r>
-              <w:rPr>
-                <w:rFonts w:ascii="Times New Roman" w:hAnsi="Times New Roman"/>
-                <w:b/>
-                <w:sz w:val="20"/>
-              </w:rPr>
-              <w:t>Tuần 14</w:t>
-            </w:r>
-          </w:p>
-        </w:tc>
-        <w:tc>
-          <w:tcPr>
-            <w:tcW w:type="dxa" w:w="1814"/>
-            <w:tcMar>
-              <w:top w:w="60" w:type="dxa"/>
-              <w:left w:w="60" w:type="dxa"/>
-              <w:bottom w:w="60" w:type="dxa"/>
-              <w:right w:w="60" w:type="dxa"/>
-            </w:tcMar>
-          </w:tcPr>
-          <w:p>
-            <w:pPr>
-              <w:jc w:val="left"/>
-            </w:pPr>
-            <w:r>
-              <w:rPr>
-                <w:rFonts w:ascii="Times New Roman" w:hAnsi="Times New Roman"/>
-                <w:sz w:val="20"/>
-              </w:rPr>
-              <w:t>Rà soát mã nguồn, chuẩn hóa docstrings &amp; unit tests</w:t>
-            </w:r>
-          </w:p>
-        </w:tc>
-        <w:tc>
-          <w:tcPr>
-            <w:tcW w:type="dxa" w:w="1814"/>
-            <w:tcMar>
-              <w:top w:w="60" w:type="dxa"/>
-              <w:left w:w="60" w:type="dxa"/>
-              <w:bottom w:w="60" w:type="dxa"/>
-              <w:right w:w="60" w:type="dxa"/>
-            </w:tcMar>
-          </w:tcPr>
-          <w:p>
-            <w:pPr>
-              <w:jc w:val="left"/>
-            </w:pPr>
-            <w:r>
-              <w:rPr>
-                <w:rFonts w:ascii="Times New Roman" w:hAnsi="Times New Roman"/>
-                <w:sz w:val="20"/>
-              </w:rPr>
-              <w:t>Chuẩn hóa code src/, đảm bảo 12/12 unit tests đạt</w:t>
-            </w:r>
-          </w:p>
-        </w:tc>
-        <w:tc>
-          <w:tcPr>
-            <w:tcW w:type="dxa" w:w="1814"/>
-            <w:tcMar>
-              <w:top w:w="60" w:type="dxa"/>
-              <w:left w:w="60" w:type="dxa"/>
-              <w:bottom w:w="60" w:type="dxa"/>
-              <w:right w:w="60" w:type="dxa"/>
-            </w:tcMar>
-          </w:tcPr>
-          <w:p>
-            <w:pPr>
-              <w:jc w:val="left"/>
-            </w:pPr>
-            <w:r>
-              <w:rPr>
-                <w:rFonts w:ascii="Times New Roman" w:hAnsi="Times New Roman"/>
-                <w:sz w:val="20"/>
-              </w:rPr>
-              <w:t>Kiểm tra tính nhất quán số liệu giữa code, CSV và báo cáo</w:t>
-            </w:r>
-          </w:p>
-        </w:tc>
-        <w:tc>
-          <w:tcPr>
-            <w:tcW w:type="dxa" w:w="1814"/>
-            <w:tcMar>
-              <w:top w:w="60" w:type="dxa"/>
-              <w:left w:w="60" w:type="dxa"/>
-              <w:bottom w:w="60" w:type="dxa"/>
-              <w:right w:w="60" w:type="dxa"/>
-            </w:tcMar>
-          </w:tcPr>
-          <w:p>
-            <w:pPr>
-              <w:jc w:val="left"/>
-            </w:pPr>
-            <w:r>
-              <w:rPr>
-                <w:rFonts w:ascii="Times New Roman" w:hAnsi="Times New Roman"/>
-                <w:sz w:val="20"/>
-              </w:rPr>
-              <w:t>Toàn bộ 12 unit tests PASSED</w:t>
-            </w:r>
-          </w:p>
-        </w:tc>
-      </w:tr>
-      <w:tr>
-        <w:tc>
-          <w:tcPr>
-            <w:tcW w:type="dxa" w:w="1814"/>
-            <w:tcMar>
-              <w:top w:w="60" w:type="dxa"/>
-              <w:left w:w="60" w:type="dxa"/>
-              <w:bottom w:w="60" w:type="dxa"/>
-              <w:right w:w="60" w:type="dxa"/>
-            </w:tcMar>
-          </w:tcPr>
-          <w:p>
-            <w:pPr>
-              <w:jc w:val="center"/>
-            </w:pPr>
-            <w:r>
-              <w:rPr>
-                <w:rFonts w:ascii="Times New Roman" w:hAnsi="Times New Roman"/>
-                <w:b/>
-                <w:sz w:val="20"/>
-              </w:rPr>
-              <w:t>Tuần 15</w:t>
+              <w:t>Nghiệm thu</w:t>
             </w:r>
           </w:p>
         </w:tc>
@@ -7919,7 +7207,7 @@
                 <w:b/>
                 <w:sz w:val="20"/>
               </w:rPr>
-              <w:t>Hoàn thiện Báo cáo bản cuối, slide &amp; đóng gói</w:t>
+              <w:t>BẢO VỆ ĐỒ ÁN TRƯỚC HỘI ĐỒNG CHẤM THI HUIT</w:t>
             </w:r>
           </w:p>
         </w:tc>
@@ -7943,7 +7231,7 @@
                 <w:b/>
                 <w:sz w:val="20"/>
               </w:rPr>
-              <w:t>Rà soát báo cáo kỹ thuật, chuẩn bị slide thuyết trình</w:t>
+              <w:t>Thuyết trình phần kỹ thuật, giải thuật và phân tích ca lỗi</w:t>
             </w:r>
           </w:p>
         </w:tc>
@@ -7967,7 +7255,7 @@
                 <w:b/>
                 <w:sz w:val="20"/>
               </w:rPr>
-              <w:t>Thiết kế bộ Slide 20 trang, quay video demo 3 phút, đóng gói ZIP</w:t>
+              <w:t>Thuyết trình phần dữ liệu, số liệu định lượng và trình diễn Demo GUI</w:t>
             </w:r>
           </w:p>
         </w:tc>
@@ -7991,163 +7279,9 @@
                 <w:b/>
                 <w:sz w:val="20"/>
               </w:rPr>
-              <w:t>Báo cáo Word/PDF, Slide PPTX, Video demo, Bộ hồ sơ nộp</w:t>
+              <w:t>Bảo vệ thành công đồ án, đạt chuẩn đầu ra môn học</w:t>
             </w:r>
           </w:p>
-        </w:tc>
-      </w:tr>
-      <w:tr>
-        <w:tc>
-          <w:tcPr>
-            <w:tcW w:type="dxa" w:w="1814"/>
-            <w:tcMar>
-              <w:top w:w="60" w:type="dxa"/>
-              <w:left w:w="60" w:type="dxa"/>
-              <w:bottom w:w="60" w:type="dxa"/>
-              <w:right w:w="60" w:type="dxa"/>
-            </w:tcMar>
-          </w:tcPr>
-          <w:p>
-            <w:pPr>
-              <w:jc w:val="center"/>
-            </w:pPr>
-            <w:r>
-              <w:rPr>
-                <w:rFonts w:ascii="Times New Roman" w:hAnsi="Times New Roman"/>
-                <w:b/>
-                <w:sz w:val="20"/>
-              </w:rPr>
-              <w:t>Sau KT</w:t>
-            </w:r>
-          </w:p>
-        </w:tc>
-        <w:tc>
-          <w:tcPr>
-            <w:tcW w:type="dxa" w:w="1814"/>
-            <w:tcMar>
-              <w:top w:w="60" w:type="dxa"/>
-              <w:left w:w="60" w:type="dxa"/>
-              <w:bottom w:w="60" w:type="dxa"/>
-              <w:right w:w="60" w:type="dxa"/>
-            </w:tcMar>
-          </w:tcPr>
-          <w:p>
-            <w:pPr>
-              <w:jc w:val="left"/>
-            </w:pPr>
-            <w:r>
-              <w:rPr>
-                <w:rFonts w:ascii="Times New Roman" w:hAnsi="Times New Roman"/>
-                <w:b/>
-                <w:sz w:val="20"/>
-              </w:rPr>
-              <w:t>NỘP TRỌN BỘ HỒ SƠ ĐỒ ÁN HOÀN CHỈNH</w:t>
-            </w:r>
-          </w:p>
-        </w:tc>
-        <w:tc>
-          <w:tcPr>
-            <w:tcW w:type="dxa" w:w="1814"/>
-            <w:tcMar>
-              <w:top w:w="60" w:type="dxa"/>
-              <w:left w:w="60" w:type="dxa"/>
-              <w:bottom w:w="60" w:type="dxa"/>
-              <w:right w:w="60" w:type="dxa"/>
-            </w:tcMar>
-          </w:tcPr>
-          <w:p>
-            <w:pPr>
-              <w:jc w:val="left"/>
-            </w:pPr>
-            <w:r>
-              <w:rPr>
-                <w:rFonts w:ascii="Times New Roman" w:hAnsi="Times New Roman"/>
-                <w:b/>
-                <w:sz w:val="20"/>
-              </w:rPr>
-              <w:t>Nộp đồ án trên cổng của Trường, bảo vệ trước Hội đồng</w:t>
-            </w:r>
-          </w:p>
-        </w:tc>
-        <w:tc>
-          <w:tcPr>
-            <w:tcW w:type="dxa" w:w="1814"/>
-            <w:tcMar>
-              <w:top w:w="60" w:type="dxa"/>
-              <w:left w:w="60" w:type="dxa"/>
-              <w:bottom w:w="60" w:type="dxa"/>
-              <w:right w:w="60" w:type="dxa"/>
-            </w:tcMar>
-          </w:tcPr>
-          <w:p>
-            <w:pPr>
-              <w:jc w:val="left"/>
-            </w:pPr>
-            <w:r>
-              <w:rPr>
-                <w:rFonts w:ascii="Times New Roman" w:hAnsi="Times New Roman"/>
-                <w:b/>
-                <w:sz w:val="20"/>
-              </w:rPr>
-              <w:t>Phối hợp nộp sản phẩm, chuẩn bị demo thực tế</w:t>
-            </w:r>
-          </w:p>
-        </w:tc>
-        <w:tc>
-          <w:tcPr>
-            <w:tcW w:type="dxa" w:w="1814"/>
-            <w:tcMar>
-              <w:top w:w="60" w:type="dxa"/>
-              <w:left w:w="60" w:type="dxa"/>
-              <w:bottom w:w="60" w:type="dxa"/>
-              <w:right w:w="60" w:type="dxa"/>
-            </w:tcMar>
-          </w:tcPr>
-          <w:p>
-            <w:pPr>
-              <w:jc w:val="left"/>
-            </w:pPr>
-            <w:r>
-              <w:rPr>
-                <w:rFonts w:ascii="Times New Roman" w:hAnsi="Times New Roman"/>
-                <w:b/>
-                <w:sz w:val="20"/>
-              </w:rPr>
-              <w:t>Bộ hồ sơ nộp đúng hạn, sẵn sàng bảo vệ</w:t>
-            </w:r>
-          </w:p>
-        </w:tc>
-      </w:tr>
-      <w:tr>
-        <w:tc>
-          <w:tcPr>
-            <w:tcW w:type="dxa" w:w="1814"/>
-          </w:tcPr>
-          <w:p/>
-        </w:tc>
-        <w:tc>
-          <w:tcPr>
-            <w:tcW w:type="dxa" w:w="1814"/>
-          </w:tcPr>
-          <w:p/>
-        </w:tc>
-        <w:tc>
-          <w:tcPr>
-            <w:tcW w:type="dxa" w:w="1814"/>
-          </w:tcPr>
-          <w:p/>
-        </w:tc>
-        <w:tc>
-          <w:tcPr>
-            <w:tcW w:type="dxa" w:w="1814"/>
-          </w:tcPr>
-          <w:p/>
-        </w:tc>
-        <w:tc>
-          <w:tcPr>
-            <w:tcW w:type="dxa" w:w="1814"/>
-          </w:tcPr>
-          <w:p/>
         </w:tc>
       </w:tr>
     </w:tbl>

</xml_diff>